<commit_message>
Update about word files
</commit_message>
<xml_diff>
--- a/txt/about-chn.docx
+++ b/txt/about-chn.docx
@@ -67,7 +67,7 @@
     <w:p>
       <w:pPr>
         <w:rPr>
-          <w:rFonts w:ascii="Work Sans" w:hAnsi="Work Sans" w:cs="AppleSystemUIFont" w:hint="eastAsia"/>
+          <w:rFonts w:ascii="Work Sans" w:hAnsi="Work Sans" w:cs="AppleSystemUIFont"/>
           <w:kern w:val="0"/>
           <w:lang w:val="en-US"/>
         </w:rPr>
@@ -319,6 +319,69 @@
           <w:kern w:val="0"/>
           <w:lang w:val="en-US"/>
         </w:rPr>
+        <w:t>」</w:t>
+      </w:r>
+    </w:p>
+    <w:p>
+      <w:pPr>
+        <w:rPr>
+          <w:rFonts w:ascii="Work Sans" w:hAnsi="Work Sans" w:cs="AppleSystemUIFont"/>
+          <w:kern w:val="0"/>
+          <w:lang w:val="en-US"/>
+        </w:rPr>
+      </w:pPr>
+      <w:proofErr w:type="spellStart"/>
+      <w:r>
+        <w:rPr>
+          <w:rFonts w:ascii="Work Sans" w:hAnsi="Work Sans" w:cs="AppleSystemUIFont"/>
+          <w:kern w:val="0"/>
+          <w:lang w:val="en-US"/>
+        </w:rPr>
+        <w:t>我正以極其緩慢的步調，經營著這項傾注了自身心血的事業</w:t>
+      </w:r>
+      <w:proofErr w:type="spellEnd"/>
+      <w:r>
+        <w:rPr>
+          <w:rFonts w:ascii="Work Sans" w:hAnsi="Work Sans" w:cs="AppleSystemUIFont"/>
+          <w:kern w:val="0"/>
+          <w:lang w:val="en-US"/>
+        </w:rPr>
+        <w:t xml:space="preserve">——Beaver Dam </w:t>
+      </w:r>
+      <w:proofErr w:type="spellStart"/>
+      <w:r>
+        <w:rPr>
+          <w:rFonts w:ascii="Work Sans" w:hAnsi="Work Sans" w:cs="AppleSystemUIFont"/>
+          <w:kern w:val="0"/>
+          <w:lang w:val="en-US"/>
+        </w:rPr>
+        <w:t>beaverdam</w:t>
+      </w:r>
+      <w:proofErr w:type="spellEnd"/>
+      <w:r>
+        <w:rPr>
+          <w:rFonts w:ascii="Work Sans" w:hAnsi="Work Sans" w:cs="AppleSystemUIFont"/>
+          <w:kern w:val="0"/>
+          <w:lang w:val="en-US"/>
+        </w:rPr>
+        <w:t>。</w:t>
+      </w:r>
+      <w:proofErr w:type="spellStart"/>
+      <w:r>
+        <w:rPr>
+          <w:rFonts w:ascii="Work Sans" w:hAnsi="Work Sans" w:cs="AppleSystemUIFont"/>
+          <w:kern w:val="0"/>
+          <w:lang w:val="en-US"/>
+        </w:rPr>
+        <w:t>我深信，優秀的品牌、優質的品牌，皆始於「在不知不覺間自然而然持續進行的事</w:t>
+      </w:r>
+      <w:proofErr w:type="spellEnd"/>
+      <w:r>
+        <w:rPr>
+          <w:rFonts w:ascii="Work Sans" w:hAnsi="Work Sans" w:cs="AppleSystemUIFont"/>
+          <w:kern w:val="0"/>
+          <w:lang w:val="en-US"/>
+        </w:rPr>
         <w:t>」。</w:t>
       </w:r>
     </w:p>
@@ -419,6 +482,7 @@
           <w:kern w:val="0"/>
           <w:lang w:val="en-US"/>
         </w:rPr>
+        <w:lastRenderedPageBreak/>
         <w:t>品牌塑造的核心在於</w:t>
       </w:r>
       <w:r>

</xml_diff>

<commit_message>
Update about content and language button state
</commit_message>
<xml_diff>
--- a/txt/about-chn.docx
+++ b/txt/about-chn.docx
@@ -299,27 +299,11 @@
       <w:proofErr w:type="spellEnd"/>
       <w:r>
         <w:rPr>
-          <w:rFonts w:ascii="Work Sans" w:hAnsi="Work Sans" w:cs="AppleSystemUIFont" w:hint="eastAsia"/>
-          <w:kern w:val="0"/>
-          <w:lang w:val="en-US"/>
-        </w:rPr>
-        <w:t>「</w:t>
-      </w:r>
-      <w:r>
-        <w:rPr>
           <w:rFonts w:ascii="Work Sans" w:hAnsi="Work Sans" w:cs="AppleSystemUIFont"/>
           <w:kern w:val="0"/>
           <w:lang w:val="en-US"/>
         </w:rPr>
         <w:t>What Gin</w:t>
-      </w:r>
-      <w:r>
-        <w:rPr>
-          <w:rFonts w:ascii="Work Sans" w:hAnsi="Work Sans" w:cs="AppleSystemUIFont" w:hint="eastAsia"/>
-          <w:kern w:val="0"/>
-          <w:lang w:val="en-US"/>
-        </w:rPr>
-        <w:t>」</w:t>
       </w:r>
     </w:p>
     <w:p>
@@ -339,16 +323,6 @@
         </w:rPr>
         <w:t>我正以極其緩慢的步調，經營著這項傾注了自身心血的事業</w:t>
       </w:r>
-      <w:proofErr w:type="spellEnd"/>
-      <w:r>
-        <w:rPr>
-          <w:rFonts w:ascii="Work Sans" w:hAnsi="Work Sans" w:cs="AppleSystemUIFont"/>
-          <w:kern w:val="0"/>
-          <w:lang w:val="en-US"/>
-        </w:rPr>
-        <w:t xml:space="preserve">——Beaver Dam </w:t>
-      </w:r>
-      <w:proofErr w:type="spellStart"/>
       <w:r>
         <w:rPr>
           <w:rFonts w:ascii="Work Sans" w:hAnsi="Work Sans" w:cs="AppleSystemUIFont"/>
@@ -544,7 +518,7 @@
           <w:kern w:val="0"/>
           <w:lang w:val="en-US"/>
         </w:rPr>
-        <w:t>——</w:t>
+        <w:t>——透</w:t>
       </w:r>
       <w:proofErr w:type="spellStart"/>
       <w:r>
@@ -553,17 +527,9 @@
           <w:kern w:val="0"/>
           <w:lang w:val="en-US"/>
         </w:rPr>
-        <w:t>透過雙手、頭腦與心靈的共同雕琢，進而改變人們的生活</w:t>
+        <w:t>過雙手、頭腦與心靈的共同雕琢，進而改變人們的生活。</w:t>
       </w:r>
       <w:proofErr w:type="spellEnd"/>
-      <w:r>
-        <w:rPr>
-          <w:rFonts w:ascii="Work Sans" w:hAnsi="Work Sans" w:cs="AppleSystemUIFont" w:hint="eastAsia"/>
-          <w:kern w:val="0"/>
-          <w:lang w:val="en-US"/>
-        </w:rPr>
-        <w:t>。</w:t>
-      </w:r>
     </w:p>
     <w:sectPr>
       <w:pgSz w:w="12240" w:h="15840"/>

</xml_diff>